<commit_message>
SEO article 2026-09-14: Director de Supply Chain Interino: cuándo la cadena de suministro no puede esperar
Co-Authored-By: Claude Sonnet 4.6 <noreply@anthropic.com>
Claude-Session: https://claude.ai/code/session_01CPqwwNdrgjFdAcMnF4pbDQ
</commit_message>
<xml_diff>
--- a/output/agent3_article.docx
+++ b/output/agent3_article.docx
@@ -14,7 +14,7 @@
         <w:t xml:space="preserve">Título SEO: </w:t>
       </w:r>
       <w:r>
-        <w:t xml:space="preserve">CEO Interino: cuándo el consejo necesita un director general de transición</w:t>
+        <w:t xml:space="preserve">Director de Supply Chain Interino: cuándo y cómo activarlo en tu empresa</w:t>
       </w:r>
     </w:p>
     <w:p>
@@ -29,7 +29,7 @@
         <w:t xml:space="preserve">Meta descripción: </w:t>
       </w:r>
       <w:r>
-        <w:t xml:space="preserve">Descubre en qué situaciones el CEO interino es la respuesta más eficaz para el consejo de administración: sucesión, transformación, vacante urgente o entrada de inversor. Guía para directivos y propietarios.</w:t>
+        <w:t xml:space="preserve">Descubre en qué situaciones un interim manager de supply chain es la respuesta más eficaz: near-shoring, disrupción de proveedores, digitalización logística o integración post-adquisición. Guía para CEOs y COOs.</w:t>
       </w:r>
     </w:p>
     <w:p>
@@ -44,7 +44,7 @@
         <w:t xml:space="preserve">URL slug: </w:t>
       </w:r>
       <w:r>
-        <w:t xml:space="preserve">/ceo-interino-director-general-transicion</w:t>
+        <w:t xml:space="preserve">/director-supply-chain-interino</w:t>
       </w:r>
     </w:p>
     <w:p>
@@ -52,7 +52,7 @@
         <w:pStyle w:val="Heading1"/>
       </w:pPr>
       <w:r>
-        <w:t xml:space="preserve">CEO Interino: cuándo el consejo necesita un director general de transición</w:t>
+        <w:t xml:space="preserve">Director de Supply Chain Interino: cuándo la cadena de suministro no puede esperar</w:t>
       </w:r>
     </w:p>
     <w:p>
@@ -60,7 +60,68 @@
         <w:spacing w:after="200"/>
       </w:pPr>
       <w:r>
-        <w:t xml:space="preserve">Hay decisiones que el consejo de administración no puede aplazar. La vacante en la dirección general es una de ellas. Cuando el CEO sale —con preaviso o sin él— la organización no entra en pausa: los equipos esperan señales, los clientes observan y los inversores evalúan. La pregunta que el consejo debe responder rápido no es solo «¿a quién nombramos?» sino «¿qué necesitamos en este momento concreto?». En muchas situaciones, la respuesta más eficaz es un CEO interino.</w:t>
+        <w:t xml:space="preserve">La cadena de suministro dejó de ser una función de segundo plano. Las empresas que operaban con modelos de aprovisionamiento ajustados al límite comprobaron, de forma directa, que la eficiencia máxima y la resiliencia mínima son una combinación de riesgo alto. En 2026, los mercados europeos más maduros —Reino Unido, Alemania, Francia— registran un crecimiento notable en la demanda de directores de supply chain con capacidad de incorporación inmediata. En España, la demanda existe, pero el contenido que orienta al decisor sobre cuándo y cómo activar este perfil ejecutivo es prácticamente inexistente. Este artículo cubre ese espacio.</w:t>
+      </w:r>
+    </w:p>
+    <w:p>
+      <w:pPr>
+        <w:pStyle w:val="Heading2"/>
+      </w:pPr>
+      <w:r>
+        <w:t xml:space="preserve">Las cuatro situaciones en que un interim manager de supply chain es la decisión más racional</w:t>
+      </w:r>
+    </w:p>
+    <w:p>
+      <w:pPr>
+        <w:spacing w:after="160"/>
+      </w:pPr>
+      <w:r>
+        <w:t xml:space="preserve">Las empresas medianas del sector industrial, manufacturero y de distribución se enfrentan a situaciones en las que la velocidad de respuesta ejecutiva importa más que el proceso de búsqueda del perfil definitivo.</w:t>
+      </w:r>
+    </w:p>
+    <w:p>
+      <w:pPr>
+        <w:spacing w:after="160"/>
+      </w:pPr>
+      <w:r>
+        <w:rPr>
+          <w:b/>
+          <w:bCs/>
+        </w:rPr>
+        <w:t xml:space="preserve">Near-shoring y diversificación de proveedores. </w:t>
+      </w:r>
+      <w:r>
+        <w:t xml:space="preserve">La tendencia global hacia el acortamiento de cadenas de suministro —acercar la producción al mercado final— exige liderazgo ejecutivo con experiencia en selección, calificación y gestión de nuevos proveedores. Es un proyecto de alta complejidad con plazos definidos: el interim management encaja de forma natural en este contexto.</w:t>
+      </w:r>
+    </w:p>
+    <w:p>
+      <w:pPr>
+        <w:spacing w:after="160"/>
+      </w:pPr>
+      <w:r>
+        <w:rPr>
+          <w:b/>
+          <w:bCs/>
+        </w:rPr>
+        <w:t xml:space="preserve">Disrupción operativa sin liderazgo disponible. </w:t>
+      </w:r>
+      <w:r>
+        <w:t xml:space="preserve">La salida imprevista de un director de compras o de supply chain en un momento crítico —un pico de demanda, una negociación contractual, una crisis logística— deja a la empresa sin el timón justo cuando más lo necesita. Un interim manager puede estar operativo en días, frente a los cuatro o seis meses que requiere una búsqueda permanente de este nivel de seniority.</w:t>
+      </w:r>
+    </w:p>
+    <w:p>
+      <w:pPr>
+        <w:spacing w:after="160"/>
+      </w:pPr>
+      <w:r>
+        <w:rPr>
+          <w:b/>
+          <w:bCs/>
+        </w:rPr>
+        <w:t xml:space="preserve">Transformación digital de la cadena de valor. </w:t>
+      </w:r>
+      <w:r>
+        <w:t xml:space="preserve">La implantación de un ERP, la integración de herramientas de visibilidad de inventario o la automatización del aprovisionamiento requieren un perfil que combine autoridad ejecutiva con conocimiento operativo profundo. Encargarlo al equipo interno sin refuerzo externo eleva el riesgo de implementación y dilata los plazos.</w:t>
       </w:r>
     </w:p>
     <w:p>
@@ -68,7 +129,14 @@
         <w:spacing w:after="200"/>
       </w:pPr>
       <w:r>
-        <w:t xml:space="preserve">El interim management aplicado a la dirección general es el eje de mayor crecimiento en los mercados europeos maduros. No es una solución de emergencia para tapar un hueco: es una decisión estratégica que permite a la empresa mantener el liderazgo ejecutivo con plena autoridad, avanzar en sus objetivos y preparar el terreno para el sucesor permanente —o para la operación corporativa que venga a continuación.</w:t>
+        <w:rPr>
+          <w:b/>
+          <w:bCs/>
+        </w:rPr>
+        <w:t xml:space="preserve">Integración post-adquisición. </w:t>
+      </w:r>
+      <w:r>
+        <w:t xml:space="preserve">Cuando una empresa absorbe otra, la armonización de dos cadenas de suministro distintas —con proveedores, sistemas y culturas de gestión diferentes— es uno de los vectores de fractura más frecuentes. El interim management aporta el liderazgo neutral que facilita la convergencia sin comprometer ninguna de las dos estructuras existentes.</w:t>
       </w:r>
     </w:p>
     <w:p>
@@ -76,39 +144,31 @@
         <w:pStyle w:val="Heading2"/>
       </w:pPr>
       <w:r>
-        <w:t xml:space="preserve">Las cuatro situaciones en que el CEO interino es la decisión más racional</w:t>
-      </w:r>
-    </w:p>
-    <w:p>
-      <w:pPr>
-        <w:spacing w:after="160"/>
-      </w:pPr>
-      <w:r>
-        <w:t xml:space="preserve">El primer error es asumir que la única respuesta a la vacante en la dirección general es acelerar la búsqueda permanente. Un proceso de selección de CEO tarda entre cuatro y ocho meses. Durante ese período, la empresa necesita liderazgo ejecutivo real, no un comité de gestión improvisado.</w:t>
-      </w:r>
-    </w:p>
-    <w:p>
-      <w:pPr>
-        <w:spacing w:after="160"/>
-      </w:pPr>
-      <w:r>
-        <w:t xml:space="preserve">La vacante urgente sin sucesor preparado es la situación más frecuente. La salida del CEO —por enfermedad, desacuerdo con el accionista, oferta externa o cierre de ciclo— deja a la organización sin cabeza visible. Promover al número dos puede ser la solución correcta a largo plazo, pero no siempre es viable a corto: el candidato interno puede no estar preparado aún, puede generar fricción política entre las áreas o puede no tener el perfil adecuado para el momento específico que atraviesa la empresa.</w:t>
-      </w:r>
-    </w:p>
-    <w:p>
-      <w:pPr>
-        <w:spacing w:after="160"/>
-      </w:pPr>
-      <w:r>
-        <w:t xml:space="preserve">El proceso de transformación estratégica que el equipo existente no puede liderar representa la segunda situación de alto valor. Una empresa que afronta una reestructuración profunda, un cambio de modelo de negocio o una integración post-adquisición puede necesitar un CEO interino precisamente porque la transformación requiere autoridad ejecutiva plena y distancia de los intereses internos. Un interim manager en la dirección general tiene el mandato claro, la experiencia en situaciones análogas y la capacidad de tomar decisiones difíciles sin hipotecar su carrera interna.</w:t>
-      </w:r>
-    </w:p>
-    <w:p>
-      <w:pPr>
-        <w:spacing w:after="160"/>
-      </w:pPr>
-      <w:r>
-        <w:t xml:space="preserve">La entrada de un inversor o el proceso de preparación para la venta generan una tercera situación donde el CEO interino aporta un valor singular. El inversor o el comprador potencial necesita un interlocutor ejecutivo con credibilidad, que domine la narrativa financiera y operativa de la empresa y que pueda gestionar el proceso sin las tensiones propias de un CEO que también negocia su propio contrato. El perfil de CEO interino ofrece esa neutralidad y esa experiencia en operaciones corporativas.</w:t>
+        <w:t xml:space="preserve">El perfil del Director de Supply Chain interino: qué aporta que el equipo interno no puede resolver solo</w:t>
+      </w:r>
+    </w:p>
+    <w:p>
+      <w:pPr>
+        <w:spacing w:after="160"/>
+      </w:pPr>
+      <w:r>
+        <w:t xml:space="preserve">El Director de Supply Chain interino no es un sustituto temporal de un directivo ausente. Es un ejecutivo senior con historial de mandatos en entornos de alta complejidad —múltiples sectores, distintos tamaños de empresa, diferentes fases del ciclo de suministro— que llega con la capacidad de diagnóstico y activación que solo proporciona haber resuelto el mismo tipo de problema varias veces.</w:t>
+      </w:r>
+    </w:p>
+    <w:p>
+      <w:pPr>
+        <w:spacing w:after="160"/>
+      </w:pPr>
+      <w:r>
+        <w:t xml:space="preserve">Su valor frente al equipo interno descansa en tres dimensiones. La visión transversal: integra procurement, logística, operaciones y tecnología como una cadena de valor única, no como departamentos estancos. La autoridad ejecutiva desde el primer día: no requiere aprendizaje organizativo para tomar decisiones. Y la orientación a resultados con horizonte definido: el interim management implica, por diseño, una misión con objetivos, plazos y criterios de éxito pactados desde el inicio.</w:t>
+      </w:r>
+    </w:p>
+    <w:p>
+      <w:pPr>
+        <w:spacing w:after="160"/>
+      </w:pPr>
+      <w:r>
+        <w:t xml:space="preserve">La disponibilidad es otro diferencial crítico. En los mercados de referencia europeos, un perfil de Director de Supply Chain interino puede incorporarse en menos de dos semanas desde el primer contacto. La brecha frente a una búsqueda permanente —que en este nivel de seniority puede extenderse cuatro o seis meses— es decisiva cuando la situación no admite espera.</w:t>
       </w:r>
     </w:p>
     <w:p>
@@ -116,7 +176,7 @@
         <w:spacing w:after="200"/>
       </w:pPr>
       <w:r>
-        <w:t xml:space="preserve">La sucesión en la empresa familiar es la cuarta situación, y una de las más delicadas. Cuando el fundador o el CEO familiar decide salir y el sucesor de la siguiente generación aún no está listo —o cuando la familia no ha resuelto quién lidera—, el CEO interino actúa como director general de transición generacional. Gestiona la empresa con autoridad plena, acompaña la profesionalización del sucesor y prepara la estructura organizativa para el relevo definitivo, sin la presión política que tendría cualquier miembro de la familia en ese rol.</w:t>
+        <w:t xml:space="preserve">El tercer elemento diferencial es la transferencia de conocimiento estructurada. El interim manager no construye para sí mismo: construye para que la organización pueda seguir adelante sin él. Los procesos documentados, los proveedores calificados y las personas desarrolladas son el legado del mandato.</w:t>
       </w:r>
     </w:p>
     <w:p>
@@ -124,23 +184,31 @@
         <w:pStyle w:val="Heading2"/>
       </w:pPr>
       <w:r>
-        <w:t xml:space="preserve">El perfil del CEO interino: qué lo diferencia de otras figuras de liderazgo transitorio</w:t>
-      </w:r>
-    </w:p>
-    <w:p>
-      <w:pPr>
-        <w:spacing w:after="160"/>
-      </w:pPr>
-      <w:r>
-        <w:t xml:space="preserve">Un CEO interino no es un gestor de continuidad que mantiene el statu quo hasta que llega el permanente. Tampoco es un consultor que recomienda sin ejecutar. El interim manager tiene autoridad ejecutiva plena desde el primer día —firma, toma decisiones, lidera el comité de dirección, representa a la empresa ante clientes, bancos e inversores— y un mandato con objetivos definidos y criterios de salida explícitos.</w:t>
-      </w:r>
-    </w:p>
-    <w:p>
-      <w:pPr>
-        <w:spacing w:after="160"/>
-      </w:pPr>
-      <w:r>
-        <w:t xml:space="preserve">Lo que distingue al CEO interino de otras figuras es la combinación de tres atributos que raramente se encuentran juntos en un perfil de contratación permanente: velocidad de diagnóstico, independencia de intereses y orientación a resultados con horizonte definido. Un CEO interino de experiencia ha liderado situaciones de alta complejidad en sectores distintos, lo que le permite identificar los problemas reales de la organización en semanas, no en meses. No tiene agenda política interna. Y sabe que su misión termina cuando los objetivos están alcanzados o cuando el sucesor está listo.</w:t>
+        <w:t xml:space="preserve">Los primeros 90 días: diagnóstico, estabilización y transformación</w:t>
+      </w:r>
+    </w:p>
+    <w:p>
+      <w:pPr>
+        <w:spacing w:after="160"/>
+      </w:pPr>
+      <w:r>
+        <w:t xml:space="preserve">La misión de un Director de Supply Chain interino se articula en tres fases que, bien ejecutadas, permiten entregar resultados tangibles en un plazo de tres meses.</w:t>
+      </w:r>
+    </w:p>
+    <w:p>
+      <w:pPr>
+        <w:spacing w:after="160"/>
+      </w:pPr>
+      <w:r>
+        <w:t xml:space="preserve">Las primeras semanas se dedican al diagnóstico de la cadena: análisis de proveedores por criticidad y nivel de riesgo, revisión de flujos logísticos, diagnóstico de la tecnología disponible y detección de las brechas de proceso más urgentes. El objetivo no es elaborar un informe exhaustivo: es activar decisiones. La velocidad de diagnóstico es, en sí misma, un diferencial del perfil interino.</w:t>
+      </w:r>
+    </w:p>
+    <w:p>
+      <w:pPr>
+        <w:spacing w:after="160"/>
+      </w:pPr>
+      <w:r>
+        <w:t xml:space="preserve">A partir de la cuarta semana, el interim manager toma el control operativo de las relaciones con los proveedores más críticos, resuelve las urgencias bloqueadas y construye la confianza del equipo interno. La capacidad de generar resultados visibles en este periodo consolida su autoridad y credibilidad ante la dirección y, cuando corresponde, ante los accionistas o el consejo.</w:t>
       </w:r>
     </w:p>
     <w:p>
@@ -148,7 +216,15 @@
         <w:spacing w:after="200"/>
       </w:pPr>
       <w:r>
-        <w:t xml:space="preserve">El interim management en la dirección general también incluye una fase de transferencia estructurada. Al finalizar el mandato, el CEO interino no desaparece: trabaja con la empresa para documentar los procesos críticos, preparar al equipo de dirección y asegurar que el conocimiento acumulado durante la misión queda en la organización.</w:t>
+        <w:t xml:space="preserve">Desde la séptima semana, el interim management entra en su fase de mayor valor estratégico: la activación de las iniciativas de transformación acordadas —digitalización, near-shoring, consolidación de proveedores— y la preparación estructurada de la salida. El criterio de éxito no es haber ejecutado las iniciativas: es haber dejado a la organización en condiciones de continuarlas de forma autónoma.</w:t>
+      </w:r>
+    </w:p>
+    <w:p>
+      <w:pPr>
+        <w:spacing w:after="200"/>
+      </w:pPr>
+      <w:r>
+        <w:t xml:space="preserve">La cadena de suministro es uno de los vectores de mayor fragilidad y mayor potencial de ventaja competitiva de la empresa mediana. Cuando el liderazgo ejecutivo falta —por vacante, por insuficiencia de seniority interna o por la escala del proyecto en curso— el tiempo sin una respuesta eficaz tiene un coste directo sobre la operativa y la cuenta de resultados. El Director de Supply Chain interino existe para cerrar esa brecha, con la velocidad que la situación exige y la profundidad que el proyecto requiere.</w:t>
       </w:r>
     </w:p>
     <w:p>
@@ -156,31 +232,59 @@
         <w:pStyle w:val="Heading2"/>
       </w:pPr>
       <w:r>
-        <w:t xml:space="preserve">Los primeros 90 días: cómo el CEO interino estabiliza, diagnostica y activa</w:t>
-      </w:r>
-    </w:p>
-    <w:p>
-      <w:pPr>
-        <w:spacing w:after="160"/>
-      </w:pPr>
-      <w:r>
-        <w:t xml:space="preserve">El valor de un CEO interino se demuestra en los primeros tres meses. La curva de aprendizaje que en una contratación permanente puede durar seis meses o un año se comprime en semanas.</w:t>
-      </w:r>
-    </w:p>
-    <w:p>
-      <w:pPr>
-        <w:spacing w:after="160"/>
-      </w:pPr>
-      <w:r>
-        <w:t xml:space="preserve">Las primeras semanas están dedicadas a la escucha estructurada: conversaciones individuales con los miembros del comité de dirección, revisión de los indicadores financieros y operativos clave, lectura de la cultura organizativa real —no la declarada— y mapeo de los aliados y los focos de resistencia. El interim manager no llega con un plan preconcebido: llega con una metodología de diagnóstico que le permite construir ese plan con los datos reales de la empresa.</w:t>
-      </w:r>
-    </w:p>
-    <w:p>
-      <w:pPr>
-        <w:spacing w:after="160"/>
-      </w:pPr>
-      <w:r>
-        <w:t xml:space="preserve">A partir de la cuarta semana, el foco se desplaza a consolidar la confianza del equipo y de la propiedad. El CEO interino comunica con claridad su mandato y sus prioridades, establece una cadencia de reporting con el consejo y gestiona la incertidumbre del equipo directivo con transparencia. En situaciones de vacante, el equipo teme lo que no sabe: el CEO interino neutraliza ese miedo con presencia y con claridad sobre el horizonte temporal.</w:t>
+        <w:t xml:space="preserve">Preguntas Frecuentes</w:t>
+      </w:r>
+    </w:p>
+    <w:p>
+      <w:pPr>
+        <w:spacing w:after="120"/>
+      </w:pPr>
+      <w:r>
+        <w:rPr>
+          <w:b/>
+          <w:bCs/>
+        </w:rPr>
+        <w:t xml:space="preserve">Una cadena de tiendas de moda española con 85 puntos de venta —empresa familiar de segunda generación con facturación de 70 M€— afronta la excedencia de tres meses de su director de compras al inicio del proceso de compras de la temporada otoño-invierno. La empresa tiene implantado un ERP desde hace dos años que el equipo no utiliza con plena eficiencia, y tiene previsto lanzar su canal de e-commerce en los próximos seis meses. ¿Cómo se articula una misión de interim management en ese contexto?</w:t>
+      </w:r>
+    </w:p>
+    <w:p>
+      <w:pPr>
+        <w:spacing w:after="160"/>
+      </w:pPr>
+      <w:r>
+        <w:t xml:space="preserve">El interim manager de supply chain asume dos roles simultáneos: cubre la dirección de compras operativa —negociaciones de temporada, control de pedidos, coordinación con proveedores clave— y lidera la optimización del ERP desde el lado de compras y logística. El perfil requerido combina experiencia en retail o moda con dominio de la herramienta ERP implantada y capacidad para estructurar un equipo de compras autónomo. Los primeros 100 días se distribuyen en tres bloques: diagnóstico y priorización de proveedores clave (semanas 1-2); cierre de la temporada otoño-invierno y arranque del plan de optimización del ERP (semanas 3-8); hoja de ruta para el canal e-commerce y preparación de la salida (semanas 9-12). El criterio de salida es la entrega de un equipo de compras autónomo y un manual de procesos actualizado.</w:t>
+      </w:r>
+    </w:p>
+    <w:p>
+      <w:pPr>
+        <w:spacing w:after="120"/>
+      </w:pPr>
+      <w:r>
+        <w:rPr>
+          <w:b/>
+          <w:bCs/>
+        </w:rPr>
+        <w:t xml:space="preserve">¿Cómo se define el mandato del Director de Supply Chain interino cuando la empresa no tiene documentados sus procesos de aprovisionamiento ni sabe con precisión qué quiere transformar?</w:t>
+      </w:r>
+    </w:p>
+    <w:p>
+      <w:pPr>
+        <w:spacing w:after="160"/>
+      </w:pPr>
+      <w:r>
+        <w:t xml:space="preserve">La ausencia de documentación de procesos no es un obstáculo: es el punto de partida más frecuente. El interim manager llega con metodología para el diagnóstico y es capaz de construir el mapa de la cadena —proveedores, flujos, cuellos de botella, brechas tecnológicas— en las primeras dos semanas. A partir de ese diagnóstico, propone a la dirección un plan de mandato con objetivos priorizados, plazos y recursos. La empresa no necesita saber exactamente qué quiere transformar: necesita saber qué problema quiere resolver. El resto lo estructura el interim manager.</w:t>
+      </w:r>
+    </w:p>
+    <w:p>
+      <w:pPr>
+        <w:spacing w:after="120"/>
+      </w:pPr>
+      <w:r>
+        <w:rPr>
+          <w:b/>
+          <w:bCs/>
+        </w:rPr>
+        <w:t xml:space="preserve">¿Puede el Director de Supply Chain interino gestionar simultáneamente la operativa diaria y liderar el proyecto de transformación de la cadena de suministro?</w:t>
       </w:r>
     </w:p>
     <w:p>
@@ -188,7 +292,7 @@
         <w:spacing w:after="200"/>
       </w:pPr>
       <w:r>
-        <w:t xml:space="preserve">En la séptima a duodécima semana, el plan de acción entra en fase de activación. Las primeras decisiones visibles —reorganizaciones, acuerdos comerciales, ajustes de estructura, primeras palancas financieras— dan al equipo la señal de que la dirección está operativa y que la empresa avanza. El interim management en la dirección general no paraliza: moviliza.</w:t>
+        <w:t xml:space="preserve">Sí, siempre que la empresa y el interim manager acuerden desde el inicio la distribución de dedicación entre ambas dimensiones. En las primeras semanas, el foco operativo es inevitable: hay urgencias que no admiten demora. A partir de la cuarta o quinta semana, la operativa tiende a estabilizarse y el perfil interino puede dedicar una proporción creciente de su tiempo al proyecto de transformación. El riesgo de no planificar este equilibrio es que el interim manager quede absorbido por la operativa y el proyecto de fondo nunca avance. Por eso, definir desde el inicio qué se considera éxito del mandato —y si incluye tanto la estabilización operativa como el avance del proyecto de transformación— es parte esencial del acuerdo de mandato.</w:t>
       </w:r>
     </w:p>
     <w:p>
@@ -196,47 +300,7 @@
         <w:pStyle w:val="Heading2"/>
       </w:pPr>
       <w:r>
-        <w:t xml:space="preserve">Preguntas Frecuentes</w:t>
-      </w:r>
-    </w:p>
-    <w:p>
-      <w:pPr>
-        <w:spacing w:after="80"/>
-      </w:pPr>
-      <w:r>
-        <w:t xml:space="preserve">Una empresa de servicios de salud ocupacional con 180 empleados pierde a su CEO fundador por motivos de salud a dos meses del cierre del ejercicio y en plena negociación de una línea de crédito con su banco. El consejo de administración —formado por tres socios— nunca ha gestionado este tipo de situación. ¿Cómo se articula una misión de CEO interino en ese contexto?</w:t>
-      </w:r>
-    </w:p>
-    <w:p>
-      <w:pPr>
-        <w:spacing w:after="160"/>
-      </w:pPr>
-      <w:r>
-        <w:t xml:space="preserve">El primer paso es definir el mandato con claridad antes de la incorporación: objetivos inmediatos (cierre del ejercicio, negociación bancaria, estabilización del equipo), horizonte temporal estimado (seis a nueve meses), estructura de reporting ante el consejo y criterios de salida. El CEO interino se incorpora en días —no semanas— y asume la representación ejecutiva plena desde el primer día, incluida la interlocución con el banco. En las primeras dos semanas realiza un diagnóstico de la situación financiera y operativa, establece la relación de confianza con los directivos internos y presenta al consejo un plan de prioridades para los primeros 90 días. En paralelo, puede acompañar la búsqueda del sucesor permanente o la preparación del relevo interno, actuando como puente entre el momento de crisis y la normalidad directiva.</w:t>
-      </w:r>
-    </w:p>
-    <w:p>
-      <w:pPr>
-        <w:spacing w:after="80"/>
-      </w:pPr>
-      <w:r>
-        <w:t xml:space="preserve">¿Puede el CEO interino preparar la empresa para la entrada de un inversor o un proceso de venta durante su mandato?</w:t>
-      </w:r>
-    </w:p>
-    <w:p>
-      <w:pPr>
-        <w:spacing w:after="160"/>
-      </w:pPr>
-      <w:r>
-        <w:t xml:space="preserve">Sí, y es uno de los escenarios donde el CEO interino aporta mayor valor diferencial. A diferencia de un CEO permanente, no tiene incentivos propios ligados a la operación que puedan sesgar sus decisiones. Puede ordenar la información financiera y operativa para el proceso de due diligence, gestionar la narrativa ante los potenciales inversores o compradores, liderar las negociaciones de primer nivel y asegurar que la empresa llega al momento de la operación en las mejores condiciones posibles. El interim management en este contexto actúa como catalizador de valor, no como gestor de mantenimiento.</w:t>
-      </w:r>
-    </w:p>
-    <w:p>
-      <w:pPr>
-        <w:spacing w:after="80"/>
-      </w:pPr>
-      <w:r>
-        <w:t xml:space="preserve">¿Cómo se estructura el reporting del CEO interino ante un consejo de administración que nunca ha supervisado a un directivo externo?</w:t>
+        <w:t xml:space="preserve">¿Su empresa necesita un Director de Supply Chain de transición?</w:t>
       </w:r>
     </w:p>
     <w:p>
@@ -244,23 +308,7 @@
         <w:spacing w:after="200"/>
       </w:pPr>
       <w:r>
-        <w:t xml:space="preserve">La relación entre el CEO interino y el consejo se establece desde el inicio con un protocolo explícito: frecuencia de reuniones (quincenal o mensual según el momento), formato del informe ejecutivo (objetivos, avance, riesgos, próximos pasos), canales de comunicación para situaciones de urgencia y límites de autonomía decisional del CEO interino para decisiones que requieren aval del consejo. Esta estructura no es burocracia: es la base de confianza que permite al CEO interino actuar con velocidad y al consejo mantener la supervisión sin microgestionar. Para un consejo sin experiencia en supervisión ejecutiva externa, el interim manager senior aporta también el criterio para construir ese protocolo desde cero.</w:t>
-      </w:r>
-    </w:p>
-    <w:p>
-      <w:pPr>
-        <w:pStyle w:val="Heading2"/>
-      </w:pPr>
-      <w:r>
-        <w:t xml:space="preserve">¿Su empresa necesita un CEO de transición?</w:t>
-      </w:r>
-    </w:p>
-    <w:p>
-      <w:pPr>
-        <w:spacing w:after="200"/>
-      </w:pPr>
-      <w:r>
-        <w:t xml:space="preserve">Si el consejo o la propiedad se enfrenta a una vacante en la dirección general, a un proceso de transformación que el equipo interno no puede liderar, a la entrada de un inversor o a una sucesión familiar sin relevo preparado, Manager in Motion identifica y moviliza el perfil de interim manager adecuado para la dirección general en el menor tiempo posible. La primera conversación es confidencial y sin compromiso.</w:t>
+        <w:t xml:space="preserve">Si la cadena de suministro enfrenta una disrupción que el equipo interno no puede resolver a la velocidad necesaria —un proyecto de near-shoring, una integración post-adquisición, una transformación digital de operaciones o la salida inesperada de un directivo clave—, Manager in Motion identifica y moviliza el perfil adecuado en el menor tiempo posible. Contacte con nosotros para una primera conversación confidencial.</w:t>
       </w:r>
     </w:p>
     <w:p>
@@ -296,42 +344,16 @@
     </w:p>
     <w:p>
       <w:pPr>
-        <w:spacing w:after="80"/>
-      </w:pPr>
-      <w:r>
-        <w:t xml:space="preserve">- IIM (Institute of Interim Management) — IIM Interim Management Survey 2026. Datos de demanda de CEO/presidente interino (+80 % interanual en UK). iim.org.uk</w:t>
-      </w:r>
-    </w:p>
-    <w:p>
-      <w:pPr>
-        <w:spacing w:after="80"/>
-      </w:pPr>
-      <w:r>
-        <w:t xml:space="preserve">- Robert Half France — «Management de transition en 2026 : les 5 situations où le choix devient rationnel». roberthalf.com/fr</w:t>
-      </w:r>
-    </w:p>
-    <w:p>
-      <w:pPr>
-        <w:spacing w:after="80"/>
-      </w:pPr>
-      <w:r>
-        <w:t xml:space="preserve">- DDIM (Dachgesellschaft Deutsches Interim Management) — Marktstudie 2026. Datos de mercado alemán: volumen ~2.700 M€, tarifas medias 1.317 €/día. ddim.de</w:t>
-      </w:r>
-    </w:p>
-    <w:p>
-      <w:pPr>
-        <w:spacing w:after="80"/>
-      </w:pPr>
-      <w:r>
-        <w:t xml:space="preserve">- Asociación Interim Management España (Interim Spain) — Congreso 2026. interimspain.org</w:t>
-      </w:r>
-    </w:p>
-    <w:p>
-      <w:pPr>
         <w:spacing w:after="200"/>
       </w:pPr>
       <w:r>
-        <w:t xml:space="preserve">- Robert Walters Europe — EU Interim Management Report 2026. Tendencias y tarifas en España y Europa. robertwalters.es</w:t>
+        <w:t xml:space="preserve">- Heidrick &amp; Struggles: "How interim talent is delivering transformation for UK businesses in 2026" (heidrick.com)
+- DDIM: "DDIM Marktstudie 2026: Interim Management behauptet sich in anspruchsvollem Marktumfeld" (ddim.de)
+- Introlution: "Unlocking Industrial Growth: How Interim Leadership Drives Transformation Across Europe and the UK" (introlution.co.uk)
+- IIM / Stanton House: "Interim Management Survey 2026: Challenges, Insights &amp; What Comes Next" (stantonhouse.com)
+- RRHHDigital: "Interim management en España: madurez pendiente y oportunidad estratégica" (rrhhdigital.com)
+- APTIE: "Transformación empresarial en 2026: el interim management acelera el cambio que las empresas necesitan" (aptie.org)
+- GH Partners: "El mercado francés del management de transición: cifras clave, tendencias 2025-2026 y perspectivas" (ghpartners.fr)</w:t>
       </w:r>
     </w:p>
     <w:sectPr>

</xml_diff>

<commit_message>
SEO article 2026-09-21: Director Comercial Interino: el liderazgo comercial que la empresa no puede esperar a contratar
Co-Authored-By: Claude Sonnet 4.6 <noreply@anthropic.com>
Claude-Session: https://claude.ai/code/session_01F53u1xGB2zegz5wQutbZPN
</commit_message>
<xml_diff>
--- a/output/agent3_article.docx
+++ b/output/agent3_article.docx
@@ -14,7 +14,7 @@
         <w:t xml:space="preserve">Título SEO: </w:t>
       </w:r>
       <w:r>
-        <w:t xml:space="preserve">Director de Supply Chain Interino: cuándo y cómo activarlo en tu empresa</w:t>
+        <w:t xml:space="preserve">Director Comercial Interino: cuándo y cómo activarlo para proteger o abrir mercados</w:t>
       </w:r>
     </w:p>
     <w:p>
@@ -29,7 +29,7 @@
         <w:t xml:space="preserve">Meta descripción: </w:t>
       </w:r>
       <w:r>
-        <w:t xml:space="preserve">Descubre en qué situaciones un interim manager de supply chain es la respuesta más eficaz: near-shoring, disrupción de proveedores, digitalización logística o integración post-adquisición. Guía para CEOs y COOs.</w:t>
+        <w:t xml:space="preserve">Un interim manager en la dirección comercial permite actuar con rapidez cuando los mercados cambian o la posición comercial de la empresa está en riesgo. Descubra cuándo tiene sentido y qué esperar de los primeros 100 días.</w:t>
       </w:r>
     </w:p>
     <w:p>
@@ -44,7 +44,7 @@
         <w:t xml:space="preserve">URL slug: </w:t>
       </w:r>
       <w:r>
-        <w:t xml:space="preserve">/director-supply-chain-interino</w:t>
+        <w:t xml:space="preserve">/blog/director-comercial-interino</w:t>
       </w:r>
     </w:p>
     <w:p>
@@ -52,15 +52,23 @@
         <w:pStyle w:val="Heading1"/>
       </w:pPr>
       <w:r>
-        <w:t xml:space="preserve">Director de Supply Chain Interino: cuándo la cadena de suministro no puede esperar</w:t>
-      </w:r>
-    </w:p>
-    <w:p>
-      <w:pPr>
-        <w:spacing w:after="200"/>
-      </w:pPr>
-      <w:r>
-        <w:t xml:space="preserve">La cadena de suministro dejó de ser una función de segundo plano. Las empresas que operaban con modelos de aprovisionamiento ajustados al límite comprobaron, de forma directa, que la eficiencia máxima y la resiliencia mínima son una combinación de riesgo alto. En 2026, los mercados europeos más maduros —Reino Unido, Alemania, Francia— registran un crecimiento notable en la demanda de directores de supply chain con capacidad de incorporación inmediata. En España, la demanda existe, pero el contenido que orienta al decisor sobre cuándo y cómo activar este perfil ejecutivo es prácticamente inexistente. Este artículo cubre ese espacio.</w:t>
+        <w:t xml:space="preserve">Director Comercial Interino: el liderazgo comercial que la empresa no puede esperar a contratar</w:t>
+      </w:r>
+    </w:p>
+    <w:p>
+      <w:pPr>
+        <w:spacing w:after="200"/>
+      </w:pPr>
+      <w:r>
+        <w:t xml:space="preserve">La agenda comercial de 2026 no tiene margen para la improvisación. La fragmentación de los mercados globales, los nuevos aranceles y la presión sobre los márgenes de exportación están obligando a muchas empresas medianas a tomar decisiones comerciales de calado en plazos que ningún proceso de selección ejecutiva puede cubrir. Cuando la posición comercial de una empresa está en riesgo — ya sea por la salida de su responsable de ventas, por la apertura urgente de un nuevo mercado o por la pérdida de un canal estratégico — el interim management ofrece una respuesta que la contratación permanente, por su naturaleza, no puede dar: liderazgo ejecutivo disponible en días, no en meses.</w:t>
+      </w:r>
+    </w:p>
+    <w:p>
+      <w:pPr>
+        <w:spacing w:after="240"/>
+      </w:pPr>
+      <w:r>
+        <w:t xml:space="preserve">El Director Comercial Interino no es un recurso de emergencia improvisado. Es un perfil de alta dirección con trayectoria probada en contextos de cambio comercial, que asume la responsabilidad plena de la función desde el primer día y trabaja con un mandato claro, un horizonte temporal definido y objetivos medibles desde el inicio.</w:t>
       </w:r>
     </w:p>
     <w:p>
@@ -68,75 +76,31 @@
         <w:pStyle w:val="Heading2"/>
       </w:pPr>
       <w:r>
-        <w:t xml:space="preserve">Las cuatro situaciones en que un interim manager de supply chain es la decisión más racional</w:t>
-      </w:r>
-    </w:p>
-    <w:p>
-      <w:pPr>
-        <w:spacing w:after="160"/>
-      </w:pPr>
-      <w:r>
-        <w:t xml:space="preserve">Las empresas medianas del sector industrial, manufacturero y de distribución se enfrentan a situaciones en las que la velocidad de respuesta ejecutiva importa más que el proceso de búsqueda del perfil definitivo.</w:t>
-      </w:r>
-    </w:p>
-    <w:p>
-      <w:pPr>
-        <w:spacing w:after="160"/>
-      </w:pPr>
-      <w:r>
-        <w:rPr>
-          <w:b/>
-          <w:bCs/>
-        </w:rPr>
-        <w:t xml:space="preserve">Near-shoring y diversificación de proveedores. </w:t>
-      </w:r>
-      <w:r>
-        <w:t xml:space="preserve">La tendencia global hacia el acortamiento de cadenas de suministro —acercar la producción al mercado final— exige liderazgo ejecutivo con experiencia en selección, calificación y gestión de nuevos proveedores. Es un proyecto de alta complejidad con plazos definidos: el interim management encaja de forma natural en este contexto.</w:t>
-      </w:r>
-    </w:p>
-    <w:p>
-      <w:pPr>
-        <w:spacing w:after="160"/>
-      </w:pPr>
-      <w:r>
-        <w:rPr>
-          <w:b/>
-          <w:bCs/>
-        </w:rPr>
-        <w:t xml:space="preserve">Disrupción operativa sin liderazgo disponible. </w:t>
-      </w:r>
-      <w:r>
-        <w:t xml:space="preserve">La salida imprevista de un director de compras o de supply chain en un momento crítico —un pico de demanda, una negociación contractual, una crisis logística— deja a la empresa sin el timón justo cuando más lo necesita. Un interim manager puede estar operativo en días, frente a los cuatro o seis meses que requiere una búsqueda permanente de este nivel de seniority.</w:t>
-      </w:r>
-    </w:p>
-    <w:p>
-      <w:pPr>
-        <w:spacing w:after="160"/>
-      </w:pPr>
-      <w:r>
-        <w:rPr>
-          <w:b/>
-          <w:bCs/>
-        </w:rPr>
-        <w:t xml:space="preserve">Transformación digital de la cadena de valor. </w:t>
-      </w:r>
-      <w:r>
-        <w:t xml:space="preserve">La implantación de un ERP, la integración de herramientas de visibilidad de inventario o la automatización del aprovisionamiento requieren un perfil que combine autoridad ejecutiva con conocimiento operativo profundo. Encargarlo al equipo interno sin refuerzo externo eleva el riesgo de implementación y dilata los plazos.</w:t>
-      </w:r>
-    </w:p>
-    <w:p>
-      <w:pPr>
-        <w:spacing w:after="200"/>
-      </w:pPr>
-      <w:r>
-        <w:rPr>
-          <w:b/>
-          <w:bCs/>
-        </w:rPr>
-        <w:t xml:space="preserve">Integración post-adquisición. </w:t>
-      </w:r>
-      <w:r>
-        <w:t xml:space="preserve">Cuando una empresa absorbe otra, la armonización de dos cadenas de suministro distintas —con proveedores, sistemas y culturas de gestión diferentes— es uno de los vectores de fractura más frecuentes. El interim management aporta el liderazgo neutral que facilita la convergencia sin comprometer ninguna de las dos estructuras existentes.</w:t>
+        <w:t xml:space="preserve">Cuándo la dirección comercial no puede esperar a una contratación permanente</w:t>
+      </w:r>
+    </w:p>
+    <w:p>
+      <w:pPr>
+        <w:spacing w:after="200"/>
+      </w:pPr>
+      <w:r>
+        <w:t xml:space="preserve">Hay situaciones en las que el tiempo entre el problema y la solución determina el daño. La salida imprevista del Director Comercial o del Director de Ventas es la más visible, pero no la única. Una empresa que inicia la apertura de un mercado exterior sin el perfil adecuado en el timón pierde las primeras ventanas de acceso. Una compañía que pierde un cliente clave por desatención comercial mientras busca candidatos permanentes ve cómo la erosión de su cartera se acelera. Una participada de private equity que debe presentar un plan de crecimiento comercial creíble a su inversor en los próximos noventa días no puede esperar seis meses a que un Director Comercial permanente se ponga al nivel exigido.</w:t>
+      </w:r>
+    </w:p>
+    <w:p>
+      <w:pPr>
+        <w:spacing w:after="200"/>
+      </w:pPr>
+      <w:r>
+        <w:t xml:space="preserve">El interim management encaja de forma natural en todos estos escenarios porque el perfil interino no necesita proceso de adaptación: llega con el diagnóstico como primer entregable. En el contexto de 2026, con la fragmentación geopolítica presionando sobre las cadenas de distribución y los acuerdos comerciales vigentes, las empresas exportadoras o en proceso de internacionalización se enfrentan a un escenario adicional: la necesidad de redirigir su estrategia de acceso a mercado con rapidez. Un interim manager con experiencia en mercados exteriores puede pivotar esa estrategia sin los meses de ramp-up que exigiría una incorporación permanente.</w:t>
+      </w:r>
+    </w:p>
+    <w:p>
+      <w:pPr>
+        <w:spacing w:after="240"/>
+      </w:pPr>
+      <w:r>
+        <w:t xml:space="preserve">La pregunta que debe hacerse cualquier empresa ante este tipo de situación no es «¿podemos permitirnos un interim manager?». La pregunta correcta es «¿podemos permitirnos no actuar mientras resolvemos la contratación permanente?».</w:t>
       </w:r>
     </w:p>
     <w:p>
@@ -144,39 +108,39 @@
         <w:pStyle w:val="Heading2"/>
       </w:pPr>
       <w:r>
-        <w:t xml:space="preserve">El perfil del Director de Supply Chain interino: qué aporta que el equipo interno no puede resolver solo</w:t>
-      </w:r>
-    </w:p>
-    <w:p>
-      <w:pPr>
-        <w:spacing w:after="160"/>
-      </w:pPr>
-      <w:r>
-        <w:t xml:space="preserve">El Director de Supply Chain interino no es un sustituto temporal de un directivo ausente. Es un ejecutivo senior con historial de mandatos en entornos de alta complejidad —múltiples sectores, distintos tamaños de empresa, diferentes fases del ciclo de suministro— que llega con la capacidad de diagnóstico y activación que solo proporciona haber resuelto el mismo tipo de problema varias veces.</w:t>
-      </w:r>
-    </w:p>
-    <w:p>
-      <w:pPr>
-        <w:spacing w:after="160"/>
-      </w:pPr>
-      <w:r>
-        <w:t xml:space="preserve">Su valor frente al equipo interno descansa en tres dimensiones. La visión transversal: integra procurement, logística, operaciones y tecnología como una cadena de valor única, no como departamentos estancos. La autoridad ejecutiva desde el primer día: no requiere aprendizaje organizativo para tomar decisiones. Y la orientación a resultados con horizonte definido: el interim management implica, por diseño, una misión con objetivos, plazos y criterios de éxito pactados desde el inicio.</w:t>
-      </w:r>
-    </w:p>
-    <w:p>
-      <w:pPr>
-        <w:spacing w:after="160"/>
-      </w:pPr>
-      <w:r>
-        <w:t xml:space="preserve">La disponibilidad es otro diferencial crítico. En los mercados de referencia europeos, un perfil de Director de Supply Chain interino puede incorporarse en menos de dos semanas desde el primer contacto. La brecha frente a una búsqueda permanente —que en este nivel de seniority puede extenderse cuatro o seis meses— es decisiva cuando la situación no admite espera.</w:t>
-      </w:r>
-    </w:p>
-    <w:p>
-      <w:pPr>
-        <w:spacing w:after="200"/>
-      </w:pPr>
-      <w:r>
-        <w:t xml:space="preserve">El tercer elemento diferencial es la transferencia de conocimiento estructurada. El interim manager no construye para sí mismo: construye para que la organización pueda seguir adelante sin él. Los procesos documentados, los proveedores calificados y las personas desarrolladas son el legado del mandato.</w:t>
+        <w:t xml:space="preserve">Qué hace un interim manager en la dirección comercial: los primeros 100 días</w:t>
+      </w:r>
+    </w:p>
+    <w:p>
+      <w:pPr>
+        <w:spacing w:after="200"/>
+      </w:pPr>
+      <w:r>
+        <w:t xml:space="preserve">El valor diferencial del interim management en la función comercial reside en la velocidad y la objetividad. Desde la primera semana, el foco es el diagnóstico: estado real de la cartera de clientes, rendimiento del equipo comercial, efectividad del proceso de ventas, posición competitiva en los canales clave. No es un diagnóstico de consultoría que concluye con un informe: es un diagnóstico ejecutivo que termina con decisiones.</w:t>
+      </w:r>
+    </w:p>
+    <w:p>
+      <w:pPr>
+        <w:spacing w:after="200"/>
+      </w:pPr>
+      <w:r>
+        <w:t xml:space="preserve">Durante el primer mes, el interim manager estabiliza la operativa — evita la pérdida de clientes durante la transición, mantiene la confianza del equipo comercial y asegura que las cuentas estratégicas tienen interlocutor ejecutivo. Al mismo tiempo, define o revisa la estrategia go-to-market: segmentación de mercado, propuesta de valor, estructura del equipo de ventas, modelo de incentivos, canales prioritarios.</w:t>
+      </w:r>
+    </w:p>
+    <w:p>
+      <w:pPr>
+        <w:spacing w:after="200"/>
+      </w:pPr>
+      <w:r>
+        <w:t xml:space="preserve">Entre el primer y el tercer mes, el foco se traslada a la ejecución y al impacto medible: apertura de canales, cierre de acuerdos en proceso, ajuste de la estructura comercial, incorporación o reorientación de perfiles en el equipo. Los KPIs de la misión se definen antes del inicio y se revisan de forma periódica con la dirección general o con el consejo.</w:t>
+      </w:r>
+    </w:p>
+    <w:p>
+      <w:pPr>
+        <w:spacing w:after="240"/>
+      </w:pPr>
+      <w:r>
+        <w:t xml:space="preserve">El último tramo de la misión está diseñado para que el conocimiento no se quede en la persona: documentación del modelo comercial, transferencia al equipo, definición del perfil permanente si se decide cubrir la posición de forma estable o, en muchos casos, validación de que el equipo interno está en condiciones de asumir la responsabilidad sin necesidad de una nueva contratación de alto nivel.</w:t>
       </w:r>
     </w:p>
     <w:p>
@@ -184,47 +148,47 @@
         <w:pStyle w:val="Heading2"/>
       </w:pPr>
       <w:r>
-        <w:t xml:space="preserve">Los primeros 90 días: diagnóstico, estabilización y transformación</w:t>
-      </w:r>
-    </w:p>
-    <w:p>
-      <w:pPr>
-        <w:spacing w:after="160"/>
-      </w:pPr>
-      <w:r>
-        <w:t xml:space="preserve">La misión de un Director de Supply Chain interino se articula en tres fases que, bien ejecutadas, permiten entregar resultados tangibles en un plazo de tres meses.</w:t>
-      </w:r>
-    </w:p>
-    <w:p>
-      <w:pPr>
-        <w:spacing w:after="160"/>
-      </w:pPr>
-      <w:r>
-        <w:t xml:space="preserve">Las primeras semanas se dedican al diagnóstico de la cadena: análisis de proveedores por criticidad y nivel de riesgo, revisión de flujos logísticos, diagnóstico de la tecnología disponible y detección de las brechas de proceso más urgentes. El objetivo no es elaborar un informe exhaustivo: es activar decisiones. La velocidad de diagnóstico es, en sí misma, un diferencial del perfil interino.</w:t>
-      </w:r>
-    </w:p>
-    <w:p>
-      <w:pPr>
-        <w:spacing w:after="160"/>
-      </w:pPr>
-      <w:r>
-        <w:t xml:space="preserve">A partir de la cuarta semana, el interim manager toma el control operativo de las relaciones con los proveedores más críticos, resuelve las urgencias bloqueadas y construye la confianza del equipo interno. La capacidad de generar resultados visibles en este periodo consolida su autoridad y credibilidad ante la dirección y, cuando corresponde, ante los accionistas o el consejo.</w:t>
-      </w:r>
-    </w:p>
-    <w:p>
-      <w:pPr>
-        <w:spacing w:after="200"/>
-      </w:pPr>
-      <w:r>
-        <w:t xml:space="preserve">Desde la séptima semana, el interim management entra en su fase de mayor valor estratégico: la activación de las iniciativas de transformación acordadas —digitalización, near-shoring, consolidación de proveedores— y la preparación estructurada de la salida. El criterio de éxito no es haber ejecutado las iniciativas: es haber dejado a la organización en condiciones de continuarlas de forma autónoma.</w:t>
-      </w:r>
-    </w:p>
-    <w:p>
-      <w:pPr>
-        <w:spacing w:after="200"/>
-      </w:pPr>
-      <w:r>
-        <w:t xml:space="preserve">La cadena de suministro es uno de los vectores de mayor fragilidad y mayor potencial de ventaja competitiva de la empresa mediana. Cuando el liderazgo ejecutivo falta —por vacante, por insuficiencia de seniority interna o por la escala del proyecto en curso— el tiempo sin una respuesta eficaz tiene un coste directo sobre la operativa y la cuenta de resultados. El Director de Supply Chain interino existe para cerrar esa brecha, con la velocidad que la situación exige y la profundidad que el proyecto requiere.</w:t>
+        <w:t xml:space="preserve">Cuándo el interim management comercial crea más valor que una contratación permanente</w:t>
+      </w:r>
+    </w:p>
+    <w:p>
+      <w:pPr>
+        <w:spacing w:after="200"/>
+      </w:pPr>
+      <w:r>
+        <w:t xml:space="preserve">No toda necesidad de liderazgo comercial justifica un proceso de selección permanente. El interim management crea más valor cuando el problema tiene un horizonte temporal definido, cuando la urgencia supera los plazos de reclutamiento habituales, o cuando la empresa necesita objetividad externa para tomar decisiones que el equipo interno no puede tomar con la misma distancia.</w:t>
+      </w:r>
+    </w:p>
+    <w:p>
+      <w:pPr>
+        <w:spacing w:after="200"/>
+      </w:pPr>
+      <w:r>
+        <w:t xml:space="preserve">La apertura de un mercado exterior es el caso más claro: requiere un perfil especializado durante los 9 a 18 meses que dura el proceso de entrada, pero no necesariamente justifica una contratación permanente hasta que el mercado está consolidado. El interim manager abre el canal, valida el modelo y deja una estructura operativa lista para ser gestionada internamente o por un perfil permanente de menor coste relativo.</w:t>
+      </w:r>
+    </w:p>
+    <w:p>
+      <w:pPr>
+        <w:spacing w:after="200"/>
+      </w:pPr>
+      <w:r>
+        <w:t xml:space="preserve">El turnaround comercial — la recuperación de una posición de ventas deteriorada — es otro escenario donde el interim manager aporta lo que un perfil interno raramente puede: la autoridad ejecutiva para tomar decisiones incómodas, la experiencia en contextos similares y la ausencia de inercias políticas internas que en muchos casos son la causa del problema.</w:t>
+      </w:r>
+    </w:p>
+    <w:p>
+      <w:pPr>
+        <w:spacing w:after="200"/>
+      </w:pPr>
+      <w:r>
+        <w:t xml:space="preserve">Por último, el momento de pre-inversión o pre-due diligence: una empresa que prepara una ronda de capital o una operación de M&amp;A necesita que la función comercial esté profesionalizada, que los indicadores sean creíbles y que el plan de crecimiento tenga un ejecutor con credenciales. Un interim manager en la dirección comercial puede construir ese escenario en el tiempo que la operación corporativa requiere.</w:t>
+      </w:r>
+    </w:p>
+    <w:p>
+      <w:pPr>
+        <w:spacing w:after="240"/>
+      </w:pPr>
+      <w:r>
+        <w:t xml:space="preserve">El interim management en la función comercial no es una solución provisional para quienes no pueden costear un directivo permanente. Es la solución correcta cuando el problema tiene fecha, cuando la urgencia manda y cuando el valor que genera una ejecución excelente en los próximos doce meses supera con creces el coste de la misión.</w:t>
       </w:r>
     </w:p>
     <w:p>
@@ -240,19 +204,15 @@
         <w:spacing w:after="120"/>
       </w:pPr>
       <w:r>
-        <w:rPr>
-          <w:b/>
-          <w:bCs/>
-        </w:rPr>
-        <w:t xml:space="preserve">Una cadena de tiendas de moda española con 85 puntos de venta —empresa familiar de segunda generación con facturación de 70 M€— afronta la excedencia de tres meses de su director de compras al inicio del proceso de compras de la temporada otoño-invierno. La empresa tiene implantado un ERP desde hace dos años que el equipo no utiliza con plena eficiencia, y tiene previsto lanzar su canal de e-commerce en los próximos seis meses. ¿Cómo se articula una misión de interim management en ese contexto?</w:t>
-      </w:r>
-    </w:p>
-    <w:p>
-      <w:pPr>
-        <w:spacing w:after="160"/>
-      </w:pPr>
-      <w:r>
-        <w:t xml:space="preserve">El interim manager de supply chain asume dos roles simultáneos: cubre la dirección de compras operativa —negociaciones de temporada, control de pedidos, coordinación con proveedores clave— y lidera la optimización del ERP desde el lado de compras y logística. El perfil requerido combina experiencia en retail o moda con dominio de la herramienta ERP implantada y capacidad para estructurar un equipo de compras autónomo. Los primeros 100 días se distribuyen en tres bloques: diagnóstico y priorización de proveedores clave (semanas 1-2); cierre de la temporada otoño-invierno y arranque del plan de optimización del ERP (semanas 3-8); hoja de ruta para el canal e-commerce y preparación de la salida (semanas 9-12). El criterio de salida es la entrega de un equipo de compras autónomo y un manual de procesos actualizado.</w:t>
+        <w:t xml:space="preserve">Una empresa industrial de componentes plásticos con sede en Cataluña y facturación de 45 M€ — propiedad de la segunda generación familiar — pierde a su Director Comercial a seis semanas de la feria sectorial más importante del año en Alemania, donde concentra el 40% de sus exportaciones. No tiene un segundo nivel directivo capaz de sustituirle. ¿Cómo se articula una misión de interim management en ese contexto?</w:t>
+      </w:r>
+    </w:p>
+    <w:p>
+      <w:pPr>
+        <w:spacing w:after="200"/>
+      </w:pPr>
+      <w:r>
+        <w:t xml:space="preserve">La misión comienza con una incorporación en menos de diez días hábiles: el primer entregable del interim manager es la revisión del estado de las cuentas clave alemanas y la confirmación de los compromisos de feria. Durante las primeras dos semanas, establece los contactos con los clientes estratégicos para asegurar la continuidad de la relación comercial y coordina la preparación de la participación ferial con el equipo existente. En paralelo, realiza un diagnóstico rápido de la cartera —rentabilidad por cliente, concentración de riesgo, procesos de cotización— que sirve de base para definir los objetivos del mandato completo. El perfil requerido es un interim manager con experiencia en ventas B2B industriales y conocimiento del mercado DACH, capaz de operar en alemán o inglés de trabajo. El horizonte de la misión es de seis a doce meses: incluye la estabilización de la cuenta alemana, la definición de la estructura comercial permanente y, si la empresa lo decide, la participación en el proceso de selección del Director Comercial permanente. El criterio de salida es la existencia de un responsable comercial estable —interno o nuevo— y un pipeline documentado y transferido.</w:t>
       </w:r>
     </w:p>
     <w:p>
@@ -260,19 +220,15 @@
         <w:spacing w:after="120"/>
       </w:pPr>
       <w:r>
-        <w:rPr>
-          <w:b/>
-          <w:bCs/>
-        </w:rPr>
-        <w:t xml:space="preserve">¿Cómo se define el mandato del Director de Supply Chain interino cuando la empresa no tiene documentados sus procesos de aprovisionamiento ni sabe con precisión qué quiere transformar?</w:t>
-      </w:r>
-    </w:p>
-    <w:p>
-      <w:pPr>
-        <w:spacing w:after="160"/>
-      </w:pPr>
-      <w:r>
-        <w:t xml:space="preserve">La ausencia de documentación de procesos no es un obstáculo: es el punto de partida más frecuente. El interim manager llega con metodología para el diagnóstico y es capaz de construir el mapa de la cadena —proveedores, flujos, cuellos de botella, brechas tecnológicas— en las primeras dos semanas. A partir de ese diagnóstico, propone a la dirección un plan de mandato con objetivos priorizados, plazos y recursos. La empresa no necesita saber exactamente qué quiere transformar: necesita saber qué problema quiere resolver. El resto lo estructura el interim manager.</w:t>
+        <w:t xml:space="preserve">¿Cómo se estructura el reporting del Director Comercial interino ante el CEO y el consejo de administración cuando la empresa no tiene definidos los indicadores de la función comercial?</w:t>
+      </w:r>
+    </w:p>
+    <w:p>
+      <w:pPr>
+        <w:spacing w:after="200"/>
+      </w:pPr>
+      <w:r>
+        <w:t xml:space="preserve">Uno de los primeros trabajos del interim manager es proponer un cuadro de mando de la función comercial que sea comprensible para la dirección general y el consejo, no solo para el equipo de ventas. En las primeras dos semanas, el interim manager define con el CEO los KPIs que importan: volumen de pipeline, ratio de conversión, tiempo de ciclo de venta, concentración de cartera, margen por canal. A partir de ahí, el reporting se hace quincenal con el CEO y mensual con el consejo si hay uno activo. La ausencia previa de indicadores no es un obstáculo sino una oportunidad: el interim manager deja instalada una cultura de medición comercial que la empresa puede mantener después de la misión, independientemente de si cubre la posición de forma permanente o distribuye las responsabilidades entre el equipo.</w:t>
       </w:r>
     </w:p>
     <w:p>
@@ -280,19 +236,15 @@
         <w:spacing w:after="120"/>
       </w:pPr>
       <w:r>
-        <w:rPr>
-          <w:b/>
-          <w:bCs/>
-        </w:rPr>
-        <w:t xml:space="preserve">¿Puede el Director de Supply Chain interino gestionar simultáneamente la operativa diaria y liderar el proyecto de transformación de la cadena de suministro?</w:t>
-      </w:r>
-    </w:p>
-    <w:p>
-      <w:pPr>
-        <w:spacing w:after="200"/>
-      </w:pPr>
-      <w:r>
-        <w:t xml:space="preserve">Sí, siempre que la empresa y el interim manager acuerden desde el inicio la distribución de dedicación entre ambas dimensiones. En las primeras semanas, el foco operativo es inevitable: hay urgencias que no admiten demora. A partir de la cuarta o quinta semana, la operativa tiende a estabilizarse y el perfil interino puede dedicar una proporción creciente de su tiempo al proyecto de transformación. El riesgo de no planificar este equilibrio es que el interim manager quede absorbido por la operativa y el proyecto de fondo nunca avance. Por eso, definir desde el inicio qué se considera éxito del mandato —y si incluye tanto la estabilización operativa como el avance del proyecto de transformación— es parte esencial del acuerdo de mandato.</w:t>
+        <w:t xml:space="preserve">Al finalizar el mandato del Director Comercial interino, ¿cómo se garantiza que el conocimiento sobre clientes, canales y procesos de venta no se pierde con su salida?</w:t>
+      </w:r>
+    </w:p>
+    <w:p>
+      <w:pPr>
+        <w:spacing w:after="240"/>
+      </w:pPr>
+      <w:r>
+        <w:t xml:space="preserve">La transferencia de conocimiento es una fase planificada desde el inicio de la misión, no un añadido de última hora. Durante los últimos treinta días del mandato, el interim manager documenta el modelo comercial: fichas de cuentas clave, estado del pipeline, procesos de cotización y onboarding de clientes, acuerdos de canal y condiciones negociadas, contactos estratégicos con nombre y contexto relacional. Esta documentación se entrega en el formato que la empresa usará de forma permanente —CRM, repositorio compartido o manual operativo— y se completa con sesiones de traspaso directo al equipo o al nuevo responsable comercial. El criterio de éxito de la transferencia no es la existencia del documento sino que el equipo que queda pueda operar sin dependencia de la memoria del interim manager.</w:t>
       </w:r>
     </w:p>
     <w:p>
@@ -300,15 +252,15 @@
         <w:pStyle w:val="Heading2"/>
       </w:pPr>
       <w:r>
-        <w:t xml:space="preserve">¿Su empresa necesita un Director de Supply Chain de transición?</w:t>
-      </w:r>
-    </w:p>
-    <w:p>
-      <w:pPr>
-        <w:spacing w:after="200"/>
-      </w:pPr>
-      <w:r>
-        <w:t xml:space="preserve">Si la cadena de suministro enfrenta una disrupción que el equipo interno no puede resolver a la velocidad necesaria —un proyecto de near-shoring, una integración post-adquisición, una transformación digital de operaciones o la salida inesperada de un directivo clave—, Manager in Motion identifica y moviliza el perfil adecuado en el menor tiempo posible. Contacte con nosotros para una primera conversación confidencial.</w:t>
+        <w:t xml:space="preserve">¿Su empresa necesita un Director Comercial interino?</w:t>
+      </w:r>
+    </w:p>
+    <w:p>
+      <w:pPr>
+        <w:spacing w:after="240"/>
+      </w:pPr>
+      <w:r>
+        <w:t xml:space="preserve">Manager in Motion dispone de una red de interim managers especializados en dirección comercial e internacionalización, con incorporación en menos de dos semanas. Si su empresa afronta una transición en la dirección comercial, la apertura de un nuevo mercado o la necesidad de profesionalizar la función de ventas antes de una operación corporativa, cuéntenos el reto.</w:t>
       </w:r>
     </w:p>
     <w:p>
@@ -344,16 +296,66 @@
     </w:p>
     <w:p>
       <w:pPr>
-        <w:spacing w:after="200"/>
-      </w:pPr>
-      <w:r>
-        <w:t xml:space="preserve">- Heidrick &amp; Struggles: "How interim talent is delivering transformation for UK businesses in 2026" (heidrick.com)
-- DDIM: "DDIM Marktstudie 2026: Interim Management behauptet sich in anspruchsvollem Marktumfeld" (ddim.de)
-- Introlution: "Unlocking Industrial Growth: How Interim Leadership Drives Transformation Across Europe and the UK" (introlution.co.uk)
-- IIM / Stanton House: "Interim Management Survey 2026: Challenges, Insights &amp; What Comes Next" (stantonhouse.com)
-- RRHHDigital: "Interim management en España: madurez pendiente y oportunidad estratégica" (rrhhdigital.com)
-- APTIE: "Transformación empresarial en 2026: el interim management acelera el cambio que las empresas necesitan" (aptie.org)
-- GH Partners: "El mercado francés del management de transición: cifras clave, tendencias 2025-2026 y perspectivas" (ghpartners.fr)</w:t>
+        <w:spacing w:after="80"/>
+      </w:pPr>
+      <w:r>
+        <w:t xml:space="preserve">- Crónica Económica (2026): "Internacionalización empresarial: estable en 2026" — dato del 9% de empresas españolas con ventas globales</w:t>
+      </w:r>
+    </w:p>
+    <w:p>
+      <w:pPr>
+        <w:spacing w:after="80"/>
+      </w:pPr>
+      <w:r>
+        <w:t xml:space="preserve">- IIM Interim Management Survey 2026 (iim.org.uk) — tendencias de demanda en el mercado británico, duración de mandatos, adopción de IA</w:t>
+      </w:r>
+    </w:p>
+    <w:p>
+      <w:pPr>
+        <w:spacing w:after="80"/>
+      </w:pPr>
+      <w:r>
+        <w:t xml:space="preserve">- DDIM Marktstudie 2026 (ddim.de) — mercado alemán de interim management, perfiles demandados, Tagessätze</w:t>
+      </w:r>
+    </w:p>
+    <w:p>
+      <w:pPr>
+        <w:spacing w:after="80"/>
+      </w:pPr>
+      <w:r>
+        <w:t xml:space="preserve">- GH Partners / Adequancy Baromètre 2026 (ghpartners.fr, adequancy.com) — mercado francés, TJM, perfil del manager de transition</w:t>
+      </w:r>
+    </w:p>
+    <w:p>
+      <w:pPr>
+        <w:spacing w:after="80"/>
+      </w:pPr>
+      <w:r>
+        <w:t xml:space="preserve">- Alvarez &amp; Marsal "Operational Alpha: How Private Equity is Building Value" (mayo 2026) — tendencias de creación de valor operacional en PE europeo</w:t>
+      </w:r>
+    </w:p>
+    <w:p>
+      <w:pPr>
+        <w:spacing w:after="80"/>
+      </w:pPr>
+      <w:r>
+        <w:t xml:space="preserve">- Roland Berger "European Private Equity Outlook 2026" — contexto de dealmaking y mandatos de gestión</w:t>
+      </w:r>
+    </w:p>
+    <w:p>
+      <w:pPr>
+        <w:spacing w:after="80"/>
+      </w:pPr>
+      <w:r>
+        <w:t xml:space="preserve">- rrhhdigital.com: "Interim management en España: madurez pendiente y oportunidad estratégica"</w:t>
+      </w:r>
+    </w:p>
+    <w:p>
+      <w:pPr>
+        <w:spacing w:after="200"/>
+      </w:pPr>
+      <w:r>
+        <w:t xml:space="preserve">- managerinmotion.eu: Página de servicio "Encuentra director comercial interino Interim Manager Ventas"</w:t>
       </w:r>
     </w:p>
     <w:sectPr>

</xml_diff>

<commit_message>
SEO article 2026-10-12: CIO Interino: el liderazgo tecnológico que la empresa mediana no puede improvisar
Co-Authored-By: Claude Sonnet 4.6 <noreply@anthropic.com>
Claude-Session: https://claude.ai/code/session_019qUw4S5AGqF4M4PKdme7bU
</commit_message>
<xml_diff>
--- a/output/agent3_article.docx
+++ b/output/agent3_article.docx
@@ -14,7 +14,7 @@
         <w:t xml:space="preserve">Título SEO: </w:t>
       </w:r>
       <w:r>
-        <w:t xml:space="preserve">Interim Manager en el Sector Energético: liderazgo ejecutivo para la transición</w:t>
+        <w:t xml:space="preserve">CIO Interino: el liderazgo tecnológico que la empresa mediana no puede improvisar</w:t>
       </w:r>
     </w:p>
     <w:p>
@@ -29,7 +29,7 @@
         <w:t xml:space="preserve">Meta descripción: </w:t>
       </w:r>
       <w:r>
-        <w:t xml:space="preserve">El sector energético crece más rápido que su talento directivo. Descubre cuándo y cómo el interim management resuelve los vacíos de liderazgo en empresas de renovables, en procesos de profesionalización y en expansión internacional.</w:t>
+        <w:t xml:space="preserve">El CIO interino asume la dirección tecnológica cuando la empresa no puede esperar a una búsqueda permanente. Qué resuelve, cómo se activa y qué esperar de los primeros 90 días.</w:t>
       </w:r>
     </w:p>
     <w:p>
@@ -44,7 +44,7 @@
         <w:t xml:space="preserve">URL slug: </w:t>
       </w:r>
       <w:r>
-        <w:t xml:space="preserve">/interim-manager-sector-energetico</w:t>
+        <w:t xml:space="preserve">/cio-interino-liderazgo-tecnologico-empresa-mediana</w:t>
       </w:r>
     </w:p>
     <w:p>
@@ -52,7 +52,7 @@
         <w:pStyle w:val="Heading1"/>
       </w:pPr>
       <w:r>
-        <w:t xml:space="preserve">Interim Manager en el Sector Energético: el liderazgo ejecutivo que la transición no puede esperar</w:t>
+        <w:t xml:space="preserve">CIO Interino: el liderazgo tecnológico que la empresa mediana no puede improvisar</w:t>
       </w:r>
     </w:p>
     <w:p>
@@ -60,7 +60,7 @@
         <w:spacing w:after="200"/>
       </w:pPr>
       <w:r>
-        <w:t xml:space="preserve">La transición energética no es un horizonte: es un proceso en marcha que está rediseñando estructuras empresariales, exigiendo nuevas competencias directivas y comprimiendo los plazos de decisión. Las empresas que operan en el sector —desde promotores de energías renovables hasta gestores de infraestructura o distribuidores de energía industrial— se enfrentan a un crecimiento que sus estructuras de liderazgo todavía no han digerido. En ese contexto, el interim management se ha consolidado como la respuesta más ágil para cubrir vacíos de dirección sin frenar el ritmo del negocio.</w:t>
+        <w:t xml:space="preserve">La función del CIO —director de sistemas de información— ocupa hoy un lugar estratégico que hace una década era impensable en la empresa mediana. Cada proyecto de transformación digital, cada migración al cloud, cada integración post-adquisición depende de alguien que combine visión tecnológica con autoridad ejecutiva para ejecutarla. El problema es que cuando esa persona falta o hay que sustituirla, la búsqueda permanente puede tardar entre cuatro y seis meses. En ese intervalo, el negocio no espera. El interim management cubre exactamente ese hueco: un CIO interino con experiencia contrastada, activo en dos a cuatro semanas.</w:t>
       </w:r>
     </w:p>
     <w:p>
@@ -68,31 +68,31 @@
         <w:pStyle w:val="Heading2"/>
       </w:pPr>
       <w:r>
-        <w:t xml:space="preserve">Un sector con vocación de crecimiento y déficit directivo estructural</w:t>
-      </w:r>
-    </w:p>
-    <w:p>
-      <w:pPr>
-        <w:spacing w:after="160"/>
-      </w:pPr>
-      <w:r>
-        <w:t xml:space="preserve">España se ha posicionado en los últimos años como uno de los mercados más activos de Europa en instalación de capacidad renovable. Este crecimiento ha generado una paradoja que las empresas del sector conocen bien: organizaciones jóvenes, con carteras de proyectos de alto valor y plantillas que se han multiplicado en poco tiempo, pero sin una estructura de liderazgo ejecutivo a la altura de ese ritmo.</w:t>
-      </w:r>
-    </w:p>
-    <w:p>
-      <w:pPr>
-        <w:spacing w:after="160"/>
-      </w:pPr>
-      <w:r>
-        <w:t xml:space="preserve">La mayoría de estas empresas han crecido bajo el impulso de sus fundadores, que simultanean la función estratégica con la operativa, la técnica con la comercial y la relación con inversores con la gestión del día a día. Cuando llega un fondo de infraestructuras, un socio estratégico europeo o un inversor institucional, las expectativas sobre gobernanza, reporting y separación de roles cambian de forma inmediata.</w:t>
-      </w:r>
-    </w:p>
-    <w:p>
-      <w:pPr>
-        <w:spacing w:after="160"/>
-      </w:pPr>
-      <w:r>
-        <w:t xml:space="preserve">Es en ese momento cuando el interim management entra en escena. No para sustituir al equipo fundador, sino para profesionalizar la función directiva, construir los procesos que la organización todavía no tiene formalizados y preparar la estructura para una etapa de mayor escala. Un interim manager con experiencia en el sector energético puede aportar desde el primer día lo que una búsqueda de perfil permanente no puede garantizar en ese plazo: la capacidad de operar en entornos regulados, de gestionar carteras de proyectos con exigencias de reporting para inversores y de construir equipos capaces de escalar.</w:t>
+        <w:t xml:space="preserve">Los momentos en los que la empresa mediana necesita un CIO interino</w:t>
+      </w:r>
+    </w:p>
+    <w:p>
+      <w:pPr>
+        <w:spacing w:after="160"/>
+      </w:pPr>
+      <w:r>
+        <w:t xml:space="preserve">No todos los contextos que generan la necesidad de un CIO interino son urgencias. El interim management aplica con igual efectividad en tres situaciones distintas.</w:t>
+      </w:r>
+    </w:p>
+    <w:p>
+      <w:pPr>
+        <w:spacing w:after="160"/>
+      </w:pPr>
+      <w:r>
+        <w:t xml:space="preserve">La más reconocible es la vacante imprevista con proyectos críticos en marcha. Cuando el responsable IT de una empresa sale de forma repentina —dimisión, enfermedad, conflicto— y hay una migración al cloud en curso, un ERP a mitad de implantación o una integración de sistemas pendiente de completar, la empresa no puede permitirse seis meses de búsqueda. Un CIO interino entra en dos a cuatro semanas, evalúa el estado real del proyecto, estabiliza la situación y decide si el plan existente es viable o necesita ser reconstituido. No hay tiempo de aprendizaje: el perfil ha gestionado situaciones similares en empresas del mismo tipo y sector.</w:t>
+      </w:r>
+    </w:p>
+    <w:p>
+      <w:pPr>
+        <w:spacing w:after="160"/>
+      </w:pPr>
+      <w:r>
+        <w:t xml:space="preserve">El segundo contexto es la reestructuración del departamento IT. Cuando una empresa externaliza parte de su función tecnológica, integra equipos de filiales distintas o reduce la estructura interna, necesita a alguien con autoridad para tomar esas decisiones y ejecutarlas. Un jefe de proyecto técnico o un consultor no tienen esa autoridad. Un interim manager en la función IT, sí.</w:t>
       </w:r>
     </w:p>
     <w:p>
@@ -100,7 +100,7 @@
         <w:spacing w:after="200"/>
       </w:pPr>
       <w:r>
-        <w:t xml:space="preserve">Los mercados de interim management más maduros de Europa —Reino Unido y Alemania— registran una demanda creciente de perfiles con especialización sectorial en energía. La señal es clara: la transición energética no solo necesita capital y tecnología; necesita también liderazgo ejecutivo de alto nivel, disponible en semanas, no en meses.</w:t>
+        <w:t xml:space="preserve">El tercer escenario, y probablemente el más infravalorado, es la profesionalización de la función IT en empresas que nunca han tenido un CIO real. Muchas han crecido con un responsable de sistemas de perfil técnico que resuelve incidencias pero no define estrategia. Cuando llega el momento de implantar un ERP corporativo, establecer una política de ciberseguridad o negociar contratos con proveedores tecnológicos, la empresa necesita una dirección de otro nivel. El interim management permite probar ese modelo sin el riesgo de una contratación permanente que puede no encajar.</w:t>
       </w:r>
     </w:p>
     <w:p>
@@ -108,39 +108,39 @@
         <w:pStyle w:val="Heading2"/>
       </w:pPr>
       <w:r>
-        <w:t xml:space="preserve">Las tres situaciones que activan una misión de interim management en energía</w:t>
-      </w:r>
-    </w:p>
-    <w:p>
-      <w:pPr>
-        <w:spacing w:after="160"/>
-      </w:pPr>
-      <w:r>
-        <w:t xml:space="preserve">No toda empresa del sector requiere un interim manager. Pero hay tres situaciones recurrentes en las que este perfil se convierte en la respuesta más eficiente.</w:t>
-      </w:r>
-    </w:p>
-    <w:p>
-      <w:pPr>
-        <w:spacing w:after="160"/>
-      </w:pPr>
-      <w:r>
-        <w:t xml:space="preserve">La primera es la entrada de un inversor. Cuando un fondo de infraestructuras, un family office o un grupo energético internacional entra en el capital, las expectativas del nuevo accionista sobre la calidad del reporting, la separación de roles directivos y la estructura de gobernanza son inmediatas. El equipo existente raramente está en condiciones de atender esas exigencias sin refuerzo externo. Un interim manager de alto nivel puede cubrir ese hueco en semanas y actuar como puente entre los requerimientos del inversor y la realidad operativa de la empresa.</w:t>
-      </w:r>
-    </w:p>
-    <w:p>
-      <w:pPr>
-        <w:spacing w:after="160"/>
-      </w:pPr>
-      <w:r>
-        <w:t xml:space="preserve">La segunda es el crecimiento acelerado con cartera de proyectos en expansión. Una empresa que pasa de gestionar tres proyectos a gestionar quince en dos años necesita reorganizar su modelo operativo, su estructura de control de costes y plazos y sus procesos de toma de decisiones. El interim management permite liderar esa transición sin paralizar el negocio ni esperar a que concluya un proceso de selección permanente de varios meses.</w:t>
-      </w:r>
-    </w:p>
-    <w:p>
-      <w:pPr>
-        <w:spacing w:after="160"/>
-      </w:pPr>
-      <w:r>
-        <w:t xml:space="preserve">La tercera es la internacionalización. Las empresas energéticas españolas están expandiéndose hacia mercados europeos —Portugal, Italia, Polonia, Alemania— y hacia Latinoamérica, sin contar siempre con el perfil directivo que exige esa expansión. Un interim manager con experiencia internacional puede liderar la apertura de un mercado nuevo, construir el equipo local y dejar un modelo de operación transferible antes de que el perfil permanente esté listo.</w:t>
+        <w:t xml:space="preserve">Qué hace un CIO interino que un jefe de proyecto técnico no puede hacer</w:t>
+      </w:r>
+    </w:p>
+    <w:p>
+      <w:pPr>
+        <w:spacing w:after="160"/>
+      </w:pPr>
+      <w:r>
+        <w:t xml:space="preserve">La diferencia entre un CIO interino y un perfil técnico elevado no es de conocimientos: es de autoridad y perspectiva ejecutiva.</w:t>
+      </w:r>
+    </w:p>
+    <w:p>
+      <w:pPr>
+        <w:spacing w:after="160"/>
+      </w:pPr>
+      <w:r>
+        <w:t xml:space="preserve">Un CIO interino actúa con plena capacidad desde el primer día. Puede revisar contratos con proveedores que no cumplen sus compromisos. Puede restructurar el equipo IT si la situación lo justifica. Puede comprometer presupuesto dentro del umbral delegado, priorizar proyectos y rechazar peticiones que no tienen justificación de negocio clara. Esa autoridad, formal y reconocida por toda la organización, es lo que permite actuar con la velocidad que la situación exige.</w:t>
+      </w:r>
+    </w:p>
+    <w:p>
+      <w:pPr>
+        <w:spacing w:after="160"/>
+      </w:pPr>
+      <w:r>
+        <w:t xml:space="preserve">En los primeros 30 días, el trabajo tiene más de diagnóstico que de ejecución. El objetivo es construir el mapa real: proyectos en marcha y su estado efectivo, contratos vigentes y su coste real, capacidades del equipo interno y dependencias críticas ante la salida del anterior responsable. Ese diagnóstico produce un mapa de riesgos y un plan de prioridades con hitos concretos, que se presenta al CEO o al comité de dirección antes de que acabe el primer mes.</w:t>
+      </w:r>
+    </w:p>
+    <w:p>
+      <w:pPr>
+        <w:spacing w:after="160"/>
+      </w:pPr>
+      <w:r>
+        <w:t xml:space="preserve">A partir del día 30, se ejecuta. Los proyectos críticos avanzan o se reconducen. Los proveedores que no cumplen se renegocian o se reemplazan. El equipo interno recibe dirección clara. El reporting tecnológico al consejo se vuelve regular y comprensible para quien no tiene perfil IT, lo que mejora de forma directa la calidad de las decisiones de inversión.</w:t>
       </w:r>
     </w:p>
     <w:p>
@@ -148,7 +148,7 @@
         <w:spacing w:after="200"/>
       </w:pPr>
       <w:r>
-        <w:t xml:space="preserve">En los tres casos, la velocidad de incorporación y la orientación a resultados desde el primer día son los factores que diferencian al interim management de cualquier alternativa de contratación convencional.</w:t>
+        <w:t xml:space="preserve">Lo que un interim manager aporta en ese proceso no es únicamente experiencia técnica: es la capacidad de tomar decisiones que afectan al negocio con criterio ejecutivo, sin necesidad de validación en cada paso.</w:t>
       </w:r>
     </w:p>
     <w:p>
@@ -156,47 +156,55 @@
         <w:pStyle w:val="Heading2"/>
       </w:pPr>
       <w:r>
-        <w:t xml:space="preserve">Cómo se articula una misión de interim management en el sector energético</w:t>
-      </w:r>
-    </w:p>
-    <w:p>
-      <w:pPr>
-        <w:spacing w:after="160"/>
-      </w:pPr>
-      <w:r>
-        <w:t xml:space="preserve">Una misión de interim management en energía no se improvisa. El perfil requerido es muy específico: experiencia directiva verificable en el sector, capacidad de operar en entornos regulados, habilidad para construir procesos desde cero y orientación a resultados que se traduzca en indicadores claros desde el primer mes.</w:t>
-      </w:r>
-    </w:p>
-    <w:p>
-      <w:pPr>
-        <w:spacing w:after="160"/>
-      </w:pPr>
-      <w:r>
-        <w:t xml:space="preserve">El proceso de incorporación sigue una secuencia lógica. En los primeros treinta días, el objetivo es entender: la cartera de proyectos, el modelo de ingresos, las relaciones con inversores y administraciones y los cuellos de botella operativos. Sin un diagnóstico riguroso de la situación de partida, cualquier decisión táctica puede resultar contraproducente.</w:t>
-      </w:r>
-    </w:p>
-    <w:p>
-      <w:pPr>
-        <w:spacing w:after="160"/>
-      </w:pPr>
-      <w:r>
-        <w:t xml:space="preserve">A partir del segundo mes, el interim manager comienza a intervenir con mayor profundidad: reorganiza procesos, establece el modelo de reporting para inversores, define los indicadores clave de la función directiva y construye el mapa de talento interno. La misión no consiste en reemplazar al equipo existente, sino en estructurarlo y dotarlo de herramientas para funcionar con mayor autonomía y eficacia.</w:t>
-      </w:r>
-    </w:p>
-    <w:p>
-      <w:pPr>
-        <w:spacing w:after="160"/>
-      </w:pPr>
-      <w:r>
-        <w:t xml:space="preserve">Hacia el final del mandato —habitualmente entre seis y doce meses, según la complejidad de la situación— el trabajo tiene una doble dimensión: entregar los resultados comprometidos y garantizar la transferencia de conocimiento. Un mandato bien ejecutado no deja un vacío cuando termina: deja una organización capaz de seguir operando sin ese apoyo externo.</w:t>
-      </w:r>
-    </w:p>
-    <w:p>
-      <w:pPr>
-        <w:spacing w:after="240"/>
-      </w:pPr>
-      <w:r>
-        <w:t xml:space="preserve">Para las empresas del sector energético en España que se encuentran en fase de crecimiento, profesionalización o internacionalización, el interim management representa una de las herramientas de gestión más eficaces disponibles en 2026. No porque sustituya la contratación permanente, sino porque la prepara y la hace más acertada.</w:t>
+        <w:t xml:space="preserve">Cómo se estructura el mandato para que genere valor sin crear dependencia</w:t>
+      </w:r>
+    </w:p>
+    <w:p>
+      <w:pPr>
+        <w:spacing w:after="160"/>
+      </w:pPr>
+      <w:r>
+        <w:t xml:space="preserve">Un mandato de CIO interino bien diseñado tiene un principio, un desarrollo y un final planificado desde el primer día. La dependencia —el riesgo de que la empresa no pueda funcionar sin el perfil interino una vez que la misión termina— es síntoma de un mandato mal estructurado, no una consecuencia inevitable del modelo.</w:t>
+      </w:r>
+    </w:p>
+    <w:p>
+      <w:pPr>
+        <w:spacing w:after="160"/>
+      </w:pPr>
+      <w:r>
+        <w:t xml:space="preserve">La duración habitual oscila entre seis y doce meses. La horquilla inferior aplica cuando el objetivo es estabilizar una situación y gestionar la transición hasta la incorporación de un perfil permanente. La horquilla superior es adecuada cuando el mandato incluye la ejecución completa de un proyecto de transformación: implantación de ERP, migración al cloud, reorganización del departamento IT.</w:t>
+      </w:r>
+    </w:p>
+    <w:p>
+      <w:pPr>
+        <w:spacing w:after="160"/>
+      </w:pPr>
+      <w:r>
+        <w:t xml:space="preserve">El modelo de reporting más habitual sitúa al CIO interino en línea directa con el CEO o el COO. En empresas con consejo de administración activo, el reporting tecnológico pasa a ser un punto regular del orden del día, lo que obliga a la dirección a hablar de tecnología en términos de negocio.</w:t>
+      </w:r>
+    </w:p>
+    <w:p>
+      <w:pPr>
+        <w:spacing w:after="160"/>
+      </w:pPr>
+      <w:r>
+        <w:t xml:space="preserve">Los criterios de éxito se definen al inicio de la misión, no a la salida. Proyectos completados en plazo y presupuesto, nivel de madurez del equipo IT interno al terminar el mandato, métricas de estabilidad operativa acordadas con el CEO. Esa claridad permite evaluar la misión sin ambigüedad y decidir el siguiente paso con datos: incorporar un CIO permanente, externalizar parte de la función o establecer un modelo de dirección IT más liviano y sostenible para la etapa siguiente.</w:t>
+      </w:r>
+    </w:p>
+    <w:p>
+      <w:pPr>
+        <w:spacing w:after="160"/>
+      </w:pPr>
+      <w:r>
+        <w:t xml:space="preserve">La transferencia de conocimiento al equipo interno o al sucesor permanente no es un entregable opcional: está formalizado desde el contrato de inicio del mandato.</w:t>
+      </w:r>
+    </w:p>
+    <w:p>
+      <w:pPr>
+        <w:spacing w:after="300"/>
+      </w:pPr>
+      <w:r>
+        <w:t xml:space="preserve">La función IT ha dejado de ser un área de soporte para convertirse en un vector de competitividad. Para la empresa mediana, una vacante en la dirección tecnológica —por breve que sea— tiene un coste que se acumula rápido: proyectos bloqueados, contratos renovados sin supervisión, equipos sin dirección clara. El interim management ofrece una respuesta ejecutiva: un interim manager que entra en semanas, actúa con autoridad real y prepara su propia salida desde el primer día.</w:t>
       </w:r>
     </w:p>
     <w:p>
@@ -209,62 +217,62 @@
     </w:p>
     <w:p>
       <w:pPr>
-        <w:spacing w:after="80"/>
+        <w:spacing w:after="120"/>
       </w:pPr>
       <w:r>
         <w:rPr>
           <w:b/>
           <w:bCs/>
         </w:rPr>
-        <w:t xml:space="preserve">Una scale-up española de energía solar fotovoltaica con 180 empleados, participada por un fondo de infraestructuras europeo, afronta la presión del inversor para separar el rol del CEO fundador de la dirección operativa antes de completar una nueva ronda de financiación. El equipo directivo existente no tiene experiencia en estructuras de gobernanza con reporting institucional. ¿Cómo se articularía un mandato de interim management en ese contexto?</w:t>
-      </w:r>
-    </w:p>
-    <w:p>
-      <w:pPr>
-        <w:spacing w:after="160"/>
-      </w:pPr>
-      <w:r>
-        <w:t xml:space="preserve">La misión se activaría como un mandato de COO o Director de Operaciones, con dos objetivos simultáneos: asumir la dirección operativa del día a día —liberando al CEO fundador para la función estratégica y la relación con el inversor— y construir el modelo de gobernanza y reporting que el fondo exige. El perfil requerido sería un interim manager con experiencia en empresas del sector energético o de infraestructuras, familiarizado con los estándares de reporting para inversores institucionales. El plazo habitual sería de nueve a doce meses: los primeros sesenta días de diagnóstico y estabilización, el tramo central de construcción de procesos, y el último trimestre de transferencia hacia una estructura directiva permanente.</w:t>
-      </w:r>
-    </w:p>
-    <w:p>
-      <w:pPr>
-        <w:spacing w:after="80"/>
+        <w:t xml:space="preserve">Un grupo alimentario con sede en Navarra, con 120 millones de facturación y tres filiales regionales, pierde a su único responsable IT corporativo cuando lleva seis meses en curso una migración al cloud. El proyecto debe completarse en cuatro meses para cumplir compromisos con el proveedor y no hay nadie en el equipo interno con autoridad suficiente para liderarlo. ¿Cómo se articularía un mandato de CIO interino en ese contexto?</w:t>
+      </w:r>
+    </w:p>
+    <w:p>
+      <w:pPr>
+        <w:spacing w:after="200"/>
+      </w:pPr>
+      <w:r>
+        <w:t xml:space="preserve">El CIO interino se incorpora con un mandato inicial de entre cuatro y seis meses con dos objetivos paralelos: finalizar la migración al cloud en el plazo comprometido con el proveedor y realizar un diagnóstico de la estructura IT de las tres filiales para definir el modelo de gobernanza tecnológica del grupo. En la primera semana, audita el estado real del proyecto con el equipo técnico y el proveedor, identifica los riesgos más urgentes y determina qué decisiones pueden tomarse de inmediato y cuáles requieren revisión. El reporting se establece en línea directa con el CEO desde el primer día. Al finalizar el mandato, el entregable incluye la migración completada, la documentación de todos los sistemas integrados y una recomendación sobre la estructura IT más adecuada para la siguiente etapa del grupo: CIO permanente, modelo de dirección compartida o externalización parcial.</w:t>
+      </w:r>
+    </w:p>
+    <w:p>
+      <w:pPr>
+        <w:spacing w:after="120"/>
       </w:pPr>
       <w:r>
         <w:rPr>
           <w:b/>
           <w:bCs/>
         </w:rPr>
-        <w:t xml:space="preserve">¿Qué evalúa y qué decide un interim manager en sus primeros 30 días en una empresa energética?</w:t>
-      </w:r>
-    </w:p>
-    <w:p>
-      <w:pPr>
-        <w:spacing w:after="160"/>
-      </w:pPr>
-      <w:r>
-        <w:t xml:space="preserve">Los primeros treinta días son de escucha y diagnóstico, no de intervención. El interim manager analiza la cartera de proyectos activa —estado, riesgos y plazos—, el modelo de ingresos y tesorería, las relaciones con la administración pública y la estructura interna del equipo. También evalúa qué procesos existen, cuáles están documentados y cuáles funcionan de manera informal. Lo que no decide en ese período: cambios de equipo, rediseño de procesos ni modificaciones en la estrategia comercial. Actuar antes de tener un diagnóstico completo es el error más frecuente en misiones de liderazgo ejecutivo en sectores de alta especialización técnica.</w:t>
-      </w:r>
-    </w:p>
-    <w:p>
-      <w:pPr>
-        <w:spacing w:after="80"/>
+        <w:t xml:space="preserve">¿Cómo se garantiza que el conocimiento del CIO interino no desaparece con su salida?</w:t>
+      </w:r>
+    </w:p>
+    <w:p>
+      <w:pPr>
+        <w:spacing w:after="200"/>
+      </w:pPr>
+      <w:r>
+        <w:t xml:space="preserve">La transferencia de conocimiento es un entregable formal del mandato, no una promesa de intención. Se define al inicio con tres componentes concretos: documentación actualizada de todos los proyectos activos y su estado, formalización de los contratos y las relaciones con proveedores clave, y plan de desarrollo del equipo IT interno con roles y responsabilidades claramente asignados. En misiones de más de seis meses, el CIO interino suele participar activamente en la selección o el onboarding del perfil permanente, asegurando una transferencia directa. El objetivo del mandato es que la función IT funcione mejor sin el interino que con él: eso es lo que distingue el interim management de una solución provisional.</w:t>
+      </w:r>
+    </w:p>
+    <w:p>
+      <w:pPr>
+        <w:spacing w:after="120"/>
       </w:pPr>
       <w:r>
         <w:rPr>
           <w:b/>
           <w:bCs/>
         </w:rPr>
-        <w:t xml:space="preserve">¿Puede un interim manager liderar la expansión de una empresa energética española hacia mercados europeos cuando aún no existe equipo local en destino?</w:t>
-      </w:r>
-    </w:p>
-    <w:p>
-      <w:pPr>
-        <w:spacing w:after="200"/>
-      </w:pPr>
-      <w:r>
-        <w:t xml:space="preserve">Sí, siempre que el perfil cuente con experiencia previa en el mercado de destino o en procesos similares de apertura internacional. La misión tendría tres fases: análisis del mercado e identificación de socios locales; activación operativa —registro legal, permisos, primeros contratos— y selección del equipo permanente; transferencia del conocimiento al equipo local y criterio de salida. Es habitual que la duración de estas misiones sea de doce a dieciocho meses, y que el mandato incluya la incorporación del perfil local que tomará el relevo.</w:t>
+        <w:t xml:space="preserve">¿Puede el CIO interino comprometer presupuesto y tomar decisiones de inversión tecnológica de forma autónoma?</w:t>
+      </w:r>
+    </w:p>
+    <w:p>
+      <w:pPr>
+        <w:spacing w:after="300"/>
+      </w:pPr>
+      <w:r>
+        <w:t xml:space="preserve">Sí, siempre que el mandato lo defina así desde el inicio, y esa es una de las condiciones que distingue un mandato eficaz de uno que no lo es. El CIO interino opera con presupuesto delegado dentro de un umbral acordado con el CEO —suficiente para gestionar contratos de mantenimiento, renovaciones y decisiones operativas del día a día— y un proceso ágil de aprobación para inversiones por encima de ese umbral. Sin esa autonomía, el interim manager pasa a operar como perfil asesor, no ejecutivo, y el valor del modelo se reduce de forma significativa. La claridad en los límites de autoridad al inicio del mandato es uno de los factores más determinantes del retorno de la misión.</w:t>
       </w:r>
     </w:p>
     <w:p>
@@ -272,15 +280,15 @@
         <w:pStyle w:val="Heading2"/>
       </w:pPr>
       <w:r>
-        <w:t xml:space="preserve">¿Su empresa energética está ante un momento de cambio?</w:t>
-      </w:r>
-    </w:p>
-    <w:p>
-      <w:pPr>
-        <w:spacing w:after="200"/>
-      </w:pPr>
-      <w:r>
-        <w:t xml:space="preserve">Manager in Motion trabaja con CEOs, consejos de administración y fondos de inversión para identificar el perfil de interim manager que mejor encaja con cada situación. Si su empresa de energías renovables está en un proceso de profesionalización, crecimiento acelerado o expansión internacional, póngase en contacto para analizar juntos la solución.</w:t>
+        <w:t xml:space="preserve">¿Necesita cubrir una vacante de CIO con urgencia?</w:t>
+      </w:r>
+    </w:p>
+    <w:p>
+      <w:pPr>
+        <w:spacing w:after="400"/>
+      </w:pPr>
+      <w:r>
+        <w:t xml:space="preserve">Manager in Motion trabaja con perfiles de director IT interino de alto nivel, disponibles en un plazo de dos a cuatro semanas. Si hay un proyecto tecnológico crítico que no puede pararse mientras se encuentra al perfil definitivo, la primera conversación no tiene coste ni compromiso.</w:t>
       </w:r>
     </w:p>
     <w:p>
@@ -288,7 +296,7 @@
         <w:spacing w:after="200" w:before="400"/>
       </w:pPr>
       <w:r>
-        <w:t xml:space="preserve">---</w:t>
+        <w:t xml:space="preserve">—</w:t>
       </w:r>
     </w:p>
     <w:p>
@@ -319,12 +327,12 @@
         <w:spacing w:after="200"/>
       </w:pPr>
       <w:r>
-        <w:t xml:space="preserve">- Red Eléctrica de España (ENAGAS/REE) — evolución de capacidad renovable instalada en España
-- Secretaría de Estado de Comercio / Invest in Spain — datos de inversión extranjera directa en España 2024
-- Russam Interim (UK) — "Frontline 17: Turning point for Interim Management", septiembre 2026; "Fractional Leadership Momentum Continues to Build", 2026
-- Institute of Interim Management (IIM) — IIM Interim Management Survey 2026
-- Robert Half — "Management de transition en 2026: les 5 situations ou le choix devient rationnel"; Estudio Intentions d'embauche S1 2026
-- DDIM / AIMP — Estudio de mercado de interim management en Alemania/DACH 2026</w:t>
+        <w:t xml:space="preserve">- Russam Insights: Interim Management Market Outlook, febrero y septiembre 2026. russam.co.uk
+- CE Interim: Interim management in Spain. ceinterim.com
+- Solutions Numériques: Infortive, comunidad de DSI de transición en Francia. solutions-numeriques.com
+- Plateya: Mejores gabinetes de management de transición Francia 2026. plateya.fr
+- OMS&amp;Co Iberia / Democrata.es: 95 mandatos en Iberia, proyección de facturación 2026
+- Barómetro Management de Transition 2026 (Florence Cohen): acceso a misiones y duración media</w:t>
       </w:r>
     </w:p>
     <w:sectPr>

</xml_diff>